<commit_message>
Insere provocação sobre o uso de IA no material da Aula 1
Nova pergunta-provocação na abertura da oficina de IA: "Você está
usando a IA para resolver problemas reais — ou para problematizar
soluções virtuais?". Entra como slide 19 do deck (agora 23 slides,
PDF regenerado), como fala de abertura e retomada no debriefing do
roteiro do docente, e como epígrafe no handout da oficina (md e docx).

Co-Authored-By: Claude Fable 5 <noreply@anthropic.com>
Claude-Session: https://claude.ai/code/session_01XEyQvt1EGpCKwCfBmzVEPH
</commit_message>
<xml_diff>
--- a/aula-01/anexos/oficina-ia-roteiro.docx
+++ b/aula-01/anexos/oficina-ia-roteiro.docx
@@ -27,6 +27,72 @@
           <w:szCs w:val="20"/>
         </w:rPr>
         <w:t xml:space="preserve">Roteiro do participante — Aula 1, Bloco 4 · 35 min de prática em ilhas</w:t>
+      </w:r>
+    </w:p>
+    <w:tbl>
+      <w:tblPr>
+        <w:tblW w:type="dxa" w:w="9638"/>
+        <w:tblBorders>
+          <w:top w:val="single" w:color="auto" w:sz="4"/>
+          <w:left w:val="single" w:color="auto" w:sz="4"/>
+          <w:bottom w:val="single" w:color="auto" w:sz="4"/>
+          <w:right w:val="single" w:color="auto" w:sz="4"/>
+          <w:insideH w:val="single" w:color="auto" w:sz="4"/>
+          <w:insideV w:val="single" w:color="auto" w:sz="4"/>
+        </w:tblBorders>
+      </w:tblPr>
+      <w:tblGrid>
+        <w:gridCol w:w="9638"/>
+      </w:tblGrid>
+      <w:tr>
+        <w:tc>
+          <w:tcPr>
+            <w:tcW w:type="dxa" w:w="9638"/>
+            <w:shd w:fill="F2F2F2" w:val="clear"/>
+            <w:tcMar>
+              <w:top w:type="dxa" w:w="100"/>
+              <w:left w:type="dxa" w:w="140"/>
+              <w:bottom w:type="dxa" w:w="100"/>
+              <w:right w:type="dxa" w:w="140"/>
+            </w:tcMar>
+          </w:tcPr>
+          <w:p>
+            <w:pPr>
+              <w:spacing w:after="80" w:line="260"/>
+            </w:pPr>
+            <w:r>
+              <w:rPr>
+                <w:i/>
+                <w:iCs/>
+                <w:sz w:val="21"/>
+                <w:szCs w:val="21"/>
+              </w:rPr>
+              <w:t xml:space="preserve">"Você está usando a IA para resolver problemas reais — ou para problematizar soluções virtuais? Estamos automatizando a burocracia, ou olhando para o problema que está na vida real?"</w:t>
+            </w:r>
+          </w:p>
+          <w:p>
+            <w:pPr>
+              <w:spacing w:after="0" w:line="260"/>
+            </w:pPr>
+            <w:r>
+              <w:rPr>
+                <w:i/>
+                <w:iCs/>
+                <w:sz w:val="21"/>
+                <w:szCs w:val="21"/>
+              </w:rPr>
+              <w:t xml:space="preserve">Mantenham a pergunta à vista durante toda a prática.</w:t>
+            </w:r>
+          </w:p>
+        </w:tc>
+      </w:tr>
+    </w:tbl>
+    <w:p>
+      <w:pPr>
+        <w:spacing w:after="120"/>
+      </w:pPr>
+      <w:r>
+        <w:t xml:space="preserve"/>
       </w:r>
     </w:p>
     <w:p>

</xml_diff>